<commit_message>
Agrega capturas de pantalla del aplicativo al manual de usuario
</commit_message>
<xml_diff>
--- a/Documentos/Manual_Usuario_MERCI.docx
+++ b/Documentos/Manual_Usuario_MERCI.docx
@@ -602,6 +602,57 @@
     </w:p>
     <w:p>
       <w:pPr>
+        <w:jc w:val="center"/>
+      </w:pPr>
+      <w:r>
+        <w:drawing>
+          <wp:inline xmlns:a="http://schemas.openxmlformats.org/drawingml/2006/main" xmlns:pic="http://schemas.openxmlformats.org/drawingml/2006/picture">
+            <wp:extent cx="5943600" cy="3962400"/>
+            <wp:docPr id="1" name="Picture 1"/>
+            <wp:cNvGraphicFramePr>
+              <a:graphicFrameLocks noChangeAspect="1"/>
+            </wp:cNvGraphicFramePr>
+            <a:graphic>
+              <a:graphicData uri="http://schemas.openxmlformats.org/drawingml/2006/picture">
+                <pic:pic>
+                  <pic:nvPicPr>
+                    <pic:cNvPr id="0" name="00-panel-general.png"/>
+                    <pic:cNvPicPr/>
+                  </pic:nvPicPr>
+                  <pic:blipFill>
+                    <a:blip r:embed="rId9"/>
+                    <a:stretch>
+                      <a:fillRect/>
+                    </a:stretch>
+                  </pic:blipFill>
+                  <pic:spPr>
+                    <a:xfrm>
+                      <a:off x="0" y="0"/>
+                      <a:ext cx="5943600" cy="3962400"/>
+                    </a:xfrm>
+                    <a:prstGeom prst="rect"/>
+                  </pic:spPr>
+                </pic:pic>
+              </a:graphicData>
+            </a:graphic>
+          </wp:inline>
+        </w:drawing>
+      </w:r>
+    </w:p>
+    <w:p>
+      <w:pPr>
+        <w:jc w:val="center"/>
+      </w:pPr>
+      <w:r>
+        <w:rPr>
+          <w:i/>
+          <w:sz w:val="18"/>
+        </w:rPr>
+        <w:t>Figura 1. Panel general (00).</w:t>
+      </w:r>
+    </w:p>
+    <w:p>
+      <w:pPr>
         <w:pStyle w:val="Heading2"/>
       </w:pPr>
       <w:r>
@@ -658,6 +709,57 @@
     </w:p>
     <w:p>
       <w:pPr>
+        <w:jc w:val="center"/>
+      </w:pPr>
+      <w:r>
+        <w:drawing>
+          <wp:inline xmlns:a="http://schemas.openxmlformats.org/drawingml/2006/main" xmlns:pic="http://schemas.openxmlformats.org/drawingml/2006/picture">
+            <wp:extent cx="5943600" cy="3962400"/>
+            <wp:docPr id="2" name="Picture 2"/>
+            <wp:cNvGraphicFramePr>
+              <a:graphicFrameLocks noChangeAspect="1"/>
+            </wp:cNvGraphicFramePr>
+            <a:graphic>
+              <a:graphicData uri="http://schemas.openxmlformats.org/drawingml/2006/picture">
+                <pic:pic>
+                  <pic:nvPicPr>
+                    <pic:cNvPr id="0" name="01-activos.png"/>
+                    <pic:cNvPicPr/>
+                  </pic:nvPicPr>
+                  <pic:blipFill>
+                    <a:blip r:embed="rId10"/>
+                    <a:stretch>
+                      <a:fillRect/>
+                    </a:stretch>
+                  </pic:blipFill>
+                  <pic:spPr>
+                    <a:xfrm>
+                      <a:off x="0" y="0"/>
+                      <a:ext cx="5943600" cy="3962400"/>
+                    </a:xfrm>
+                    <a:prstGeom prst="rect"/>
+                  </pic:spPr>
+                </pic:pic>
+              </a:graphicData>
+            </a:graphic>
+          </wp:inline>
+        </w:drawing>
+      </w:r>
+    </w:p>
+    <w:p>
+      <w:pPr>
+        <w:jc w:val="center"/>
+      </w:pPr>
+      <w:r>
+        <w:rPr>
+          <w:i/>
+          <w:sz w:val="18"/>
+        </w:rPr>
+        <w:t>Figura 2. Inventario de activos (01).</w:t>
+      </w:r>
+    </w:p>
+    <w:p>
+      <w:pPr>
         <w:pStyle w:val="Heading2"/>
       </w:pPr>
       <w:r>
@@ -719,6 +821,57 @@
     </w:p>
     <w:p>
       <w:pPr>
+        <w:jc w:val="center"/>
+      </w:pPr>
+      <w:r>
+        <w:drawing>
+          <wp:inline xmlns:a="http://schemas.openxmlformats.org/drawingml/2006/main" xmlns:pic="http://schemas.openxmlformats.org/drawingml/2006/picture">
+            <wp:extent cx="5943600" cy="5865178"/>
+            <wp:docPr id="3" name="Picture 3"/>
+            <wp:cNvGraphicFramePr>
+              <a:graphicFrameLocks noChangeAspect="1"/>
+            </wp:cNvGraphicFramePr>
+            <a:graphic>
+              <a:graphicData uri="http://schemas.openxmlformats.org/drawingml/2006/picture">
+                <pic:pic>
+                  <pic:nvPicPr>
+                    <pic:cNvPr id="0" name="02-amenazas.png"/>
+                    <pic:cNvPicPr/>
+                  </pic:nvPicPr>
+                  <pic:blipFill>
+                    <a:blip r:embed="rId11"/>
+                    <a:stretch>
+                      <a:fillRect/>
+                    </a:stretch>
+                  </pic:blipFill>
+                  <pic:spPr>
+                    <a:xfrm>
+                      <a:off x="0" y="0"/>
+                      <a:ext cx="5943600" cy="5865178"/>
+                    </a:xfrm>
+                    <a:prstGeom prst="rect"/>
+                  </pic:spPr>
+                </pic:pic>
+              </a:graphicData>
+            </a:graphic>
+          </wp:inline>
+        </w:drawing>
+      </w:r>
+    </w:p>
+    <w:p>
+      <w:pPr>
+        <w:jc w:val="center"/>
+      </w:pPr>
+      <w:r>
+        <w:rPr>
+          <w:i/>
+          <w:sz w:val="18"/>
+        </w:rPr>
+        <w:t>Figura 3. Catálogos de amenazas, vulnerabilidades y controles existentes (02).</w:t>
+      </w:r>
+    </w:p>
+    <w:p>
+      <w:pPr>
         <w:pStyle w:val="Heading2"/>
       </w:pPr>
       <w:r>
@@ -775,6 +928,57 @@
     </w:p>
     <w:p>
       <w:pPr>
+        <w:jc w:val="center"/>
+      </w:pPr>
+      <w:r>
+        <w:drawing>
+          <wp:inline xmlns:a="http://schemas.openxmlformats.org/drawingml/2006/main" xmlns:pic="http://schemas.openxmlformats.org/drawingml/2006/picture">
+            <wp:extent cx="5943600" cy="3962400"/>
+            <wp:docPr id="4" name="Picture 4"/>
+            <wp:cNvGraphicFramePr>
+              <a:graphicFrameLocks noChangeAspect="1"/>
+            </wp:cNvGraphicFramePr>
+            <a:graphic>
+              <a:graphicData uri="http://schemas.openxmlformats.org/drawingml/2006/picture">
+                <pic:pic>
+                  <pic:nvPicPr>
+                    <pic:cNvPr id="0" name="03-riesgos.png"/>
+                    <pic:cNvPicPr/>
+                  </pic:nvPicPr>
+                  <pic:blipFill>
+                    <a:blip r:embed="rId12"/>
+                    <a:stretch>
+                      <a:fillRect/>
+                    </a:stretch>
+                  </pic:blipFill>
+                  <pic:spPr>
+                    <a:xfrm>
+                      <a:off x="0" y="0"/>
+                      <a:ext cx="5943600" cy="3962400"/>
+                    </a:xfrm>
+                    <a:prstGeom prst="rect"/>
+                  </pic:spPr>
+                </pic:pic>
+              </a:graphicData>
+            </a:graphic>
+          </wp:inline>
+        </w:drawing>
+      </w:r>
+    </w:p>
+    <w:p>
+      <w:pPr>
+        <w:jc w:val="center"/>
+      </w:pPr>
+      <w:r>
+        <w:rPr>
+          <w:i/>
+          <w:sz w:val="18"/>
+        </w:rPr>
+        <w:t>Figura 4. Escenarios de riesgo y matriz de calor (03).</w:t>
+      </w:r>
+    </w:p>
+    <w:p>
+      <w:pPr>
         <w:pStyle w:val="Heading2"/>
       </w:pPr>
       <w:r>
@@ -843,6 +1047,108 @@
     </w:p>
     <w:p>
       <w:pPr>
+        <w:jc w:val="center"/>
+      </w:pPr>
+      <w:r>
+        <w:drawing>
+          <wp:inline xmlns:a="http://schemas.openxmlformats.org/drawingml/2006/main" xmlns:pic="http://schemas.openxmlformats.org/drawingml/2006/picture">
+            <wp:extent cx="5943600" cy="3962400"/>
+            <wp:docPr id="5" name="Picture 5"/>
+            <wp:cNvGraphicFramePr>
+              <a:graphicFrameLocks noChangeAspect="1"/>
+            </wp:cNvGraphicFramePr>
+            <a:graphic>
+              <a:graphicData uri="http://schemas.openxmlformats.org/drawingml/2006/picture">
+                <pic:pic>
+                  <pic:nvPicPr>
+                    <pic:cNvPr id="0" name="04a-tratamiento.png"/>
+                    <pic:cNvPicPr/>
+                  </pic:nvPicPr>
+                  <pic:blipFill>
+                    <a:blip r:embed="rId13"/>
+                    <a:stretch>
+                      <a:fillRect/>
+                    </a:stretch>
+                  </pic:blipFill>
+                  <pic:spPr>
+                    <a:xfrm>
+                      <a:off x="0" y="0"/>
+                      <a:ext cx="5943600" cy="3962400"/>
+                    </a:xfrm>
+                    <a:prstGeom prst="rect"/>
+                  </pic:spPr>
+                </pic:pic>
+              </a:graphicData>
+            </a:graphic>
+          </wp:inline>
+        </w:drawing>
+      </w:r>
+    </w:p>
+    <w:p>
+      <w:pPr>
+        <w:jc w:val="center"/>
+      </w:pPr>
+      <w:r>
+        <w:rPr>
+          <w:i/>
+          <w:sz w:val="18"/>
+        </w:rPr>
+        <w:t>Figura 5. Plan de tratamiento (04).</w:t>
+      </w:r>
+    </w:p>
+    <w:p>
+      <w:pPr>
+        <w:jc w:val="center"/>
+      </w:pPr>
+      <w:r>
+        <w:drawing>
+          <wp:inline xmlns:a="http://schemas.openxmlformats.org/drawingml/2006/main" xmlns:pic="http://schemas.openxmlformats.org/drawingml/2006/picture">
+            <wp:extent cx="5943600" cy="3962400"/>
+            <wp:docPr id="6" name="Picture 6"/>
+            <wp:cNvGraphicFramePr>
+              <a:graphicFrameLocks noChangeAspect="1"/>
+            </wp:cNvGraphicFramePr>
+            <a:graphic>
+              <a:graphicData uri="http://schemas.openxmlformats.org/drawingml/2006/picture">
+                <pic:pic>
+                  <pic:nvPicPr>
+                    <pic:cNvPr id="0" name="04b-tratamiento-modal.png"/>
+                    <pic:cNvPicPr/>
+                  </pic:nvPicPr>
+                  <pic:blipFill>
+                    <a:blip r:embed="rId14"/>
+                    <a:stretch>
+                      <a:fillRect/>
+                    </a:stretch>
+                  </pic:blipFill>
+                  <pic:spPr>
+                    <a:xfrm>
+                      <a:off x="0" y="0"/>
+                      <a:ext cx="5943600" cy="3962400"/>
+                    </a:xfrm>
+                    <a:prstGeom prst="rect"/>
+                  </pic:spPr>
+                </pic:pic>
+              </a:graphicData>
+            </a:graphic>
+          </wp:inline>
+        </w:drawing>
+      </w:r>
+    </w:p>
+    <w:p>
+      <w:pPr>
+        <w:jc w:val="center"/>
+      </w:pPr>
+      <w:r>
+        <w:rPr>
+          <w:i/>
+          <w:sz w:val="18"/>
+        </w:rPr>
+        <w:t>Figura 6. Modal de edición de tratamiento, con controles existentes sugeridos.</w:t>
+      </w:r>
+    </w:p>
+    <w:p>
+      <w:pPr>
         <w:pStyle w:val="Heading2"/>
       </w:pPr>
       <w:r>
@@ -856,6 +1162,57 @@
     </w:p>
     <w:p>
       <w:pPr>
+        <w:jc w:val="center"/>
+      </w:pPr>
+      <w:r>
+        <w:drawing>
+          <wp:inline xmlns:a="http://schemas.openxmlformats.org/drawingml/2006/main" xmlns:pic="http://schemas.openxmlformats.org/drawingml/2006/picture">
+            <wp:extent cx="5943600" cy="3962400"/>
+            <wp:docPr id="7" name="Picture 7"/>
+            <wp:cNvGraphicFramePr>
+              <a:graphicFrameLocks noChangeAspect="1"/>
+            </wp:cNvGraphicFramePr>
+            <a:graphic>
+              <a:graphicData uri="http://schemas.openxmlformats.org/drawingml/2006/picture">
+                <pic:pic>
+                  <pic:nvPicPr>
+                    <pic:cNvPr id="0" name="05-residual.png"/>
+                    <pic:cNvPicPr/>
+                  </pic:nvPicPr>
+                  <pic:blipFill>
+                    <a:blip r:embed="rId15"/>
+                    <a:stretch>
+                      <a:fillRect/>
+                    </a:stretch>
+                  </pic:blipFill>
+                  <pic:spPr>
+                    <a:xfrm>
+                      <a:off x="0" y="0"/>
+                      <a:ext cx="5943600" cy="3962400"/>
+                    </a:xfrm>
+                    <a:prstGeom prst="rect"/>
+                  </pic:spPr>
+                </pic:pic>
+              </a:graphicData>
+            </a:graphic>
+          </wp:inline>
+        </w:drawing>
+      </w:r>
+    </w:p>
+    <w:p>
+      <w:pPr>
+        <w:jc w:val="center"/>
+      </w:pPr>
+      <w:r>
+        <w:rPr>
+          <w:i/>
+          <w:sz w:val="18"/>
+        </w:rPr>
+        <w:t>Figura 7. Riesgo residual (05), con alerta de asimetría de tratamiento.</w:t>
+      </w:r>
+    </w:p>
+    <w:p>
+      <w:pPr>
         <w:pStyle w:val="Heading2"/>
       </w:pPr>
       <w:r>
@@ -893,6 +1250,57 @@
     </w:p>
     <w:p>
       <w:pPr>
+        <w:jc w:val="center"/>
+      </w:pPr>
+      <w:r>
+        <w:drawing>
+          <wp:inline xmlns:a="http://schemas.openxmlformats.org/drawingml/2006/main" xmlns:pic="http://schemas.openxmlformats.org/drawingml/2006/picture">
+            <wp:extent cx="5943600" cy="4342130"/>
+            <wp:docPr id="8" name="Picture 8"/>
+            <wp:cNvGraphicFramePr>
+              <a:graphicFrameLocks noChangeAspect="1"/>
+            </wp:cNvGraphicFramePr>
+            <a:graphic>
+              <a:graphicData uri="http://schemas.openxmlformats.org/drawingml/2006/picture">
+                <pic:pic>
+                  <pic:nvPicPr>
+                    <pic:cNvPr id="0" name="06-comunicacion.png"/>
+                    <pic:cNvPicPr/>
+                  </pic:nvPicPr>
+                  <pic:blipFill>
+                    <a:blip r:embed="rId16"/>
+                    <a:stretch>
+                      <a:fillRect/>
+                    </a:stretch>
+                  </pic:blipFill>
+                  <pic:spPr>
+                    <a:xfrm>
+                      <a:off x="0" y="0"/>
+                      <a:ext cx="5943600" cy="4342130"/>
+                    </a:xfrm>
+                    <a:prstGeom prst="rect"/>
+                  </pic:spPr>
+                </pic:pic>
+              </a:graphicData>
+            </a:graphic>
+          </wp:inline>
+        </w:drawing>
+      </w:r>
+    </w:p>
+    <w:p>
+      <w:pPr>
+        <w:jc w:val="center"/>
+      </w:pPr>
+      <w:r>
+        <w:rPr>
+          <w:i/>
+          <w:sz w:val="18"/>
+        </w:rPr>
+        <w:t>Figura 8. Comunicación y consulta (06), con un reporte ejecutivo generado.</w:t>
+      </w:r>
+    </w:p>
+    <w:p>
+      <w:pPr>
         <w:pStyle w:val="Heading2"/>
       </w:pPr>
       <w:r>
@@ -902,6 +1310,57 @@
     <w:p>
       <w:r>
         <w:t>Presenta un medidor (gauge) por cada KPI definido en la Sección XIV del informe metodológico MERCI, con su meta, frecuencia de revisión y valor actual. El valor actual se actualiza escribiendo el nuevo dato en el campo numérico junto al indicador; el color del medidor cambia según qué tan cerca o lejos está el valor de su meta.</w:t>
+      </w:r>
+    </w:p>
+    <w:p>
+      <w:pPr>
+        <w:jc w:val="center"/>
+      </w:pPr>
+      <w:r>
+        <w:drawing>
+          <wp:inline xmlns:a="http://schemas.openxmlformats.org/drawingml/2006/main" xmlns:pic="http://schemas.openxmlformats.org/drawingml/2006/picture">
+            <wp:extent cx="5943600" cy="3962400"/>
+            <wp:docPr id="9" name="Picture 9"/>
+            <wp:cNvGraphicFramePr>
+              <a:graphicFrameLocks noChangeAspect="1"/>
+            </wp:cNvGraphicFramePr>
+            <a:graphic>
+              <a:graphicData uri="http://schemas.openxmlformats.org/drawingml/2006/picture">
+                <pic:pic>
+                  <pic:nvPicPr>
+                    <pic:cNvPr id="0" name="07-monitoreo.png"/>
+                    <pic:cNvPicPr/>
+                  </pic:nvPicPr>
+                  <pic:blipFill>
+                    <a:blip r:embed="rId17"/>
+                    <a:stretch>
+                      <a:fillRect/>
+                    </a:stretch>
+                  </pic:blipFill>
+                  <pic:spPr>
+                    <a:xfrm>
+                      <a:off x="0" y="0"/>
+                      <a:ext cx="5943600" cy="3962400"/>
+                    </a:xfrm>
+                    <a:prstGeom prst="rect"/>
+                  </pic:spPr>
+                </pic:pic>
+              </a:graphicData>
+            </a:graphic>
+          </wp:inline>
+        </w:drawing>
+      </w:r>
+    </w:p>
+    <w:p>
+      <w:pPr>
+        <w:jc w:val="center"/>
+      </w:pPr>
+      <w:r>
+        <w:rPr>
+          <w:i/>
+          <w:sz w:val="18"/>
+        </w:rPr>
+        <w:t>Figura 9. Panel de monitoreo continuo (07).</w:t>
       </w:r>
     </w:p>
     <w:p>

</xml_diff>